<commit_message>
Fictional addresses and registration numbers in all cases
Real streets/buildings (incl. a residential address for the ET1 claimant)
and valid-looking VAT/NIF/CIF/company numbers replaced; UK postcodes moved
to the non-existent ZZ area. case_version: harbor-dispute 6,
brightwater-acquisition 3, kite-launch 3.

Signed-off-by: Kallam <info@kallam.ai>
</commit_message>
<xml_diff>
--- a/cases/brightwater-acquisition/docs/01_spa_draft_7_2025-03-07.docx
+++ b/cases/brightwater-acquisition/docs/01_spa_draft_7_2025-03-07.docx
@@ -51,7 +51,7 @@
         <w:rPr>
           <w:b w:val="0"/>
         </w:rPr>
-        <w:t xml:space="preserve"> (company number 11483920) of 14 Bruton Place, London W1J 6LX (the "Buyer")</w:t>
+        <w:t xml:space="preserve"> (company number 00000001) of 14 Ashgrove Mews, London ZZ3 6LX (the "Buyer")</w:t>
       </w:r>
     </w:p>
     <w:p>
@@ -65,7 +65,7 @@
         <w:rPr>
           <w:b w:val="0"/>
         </w:rPr>
-        <w:t xml:space="preserve"> (company number 10177245) of Floor 3, 26 Clerkenwell Road, London EC1M 5PQ (the "Company")</w:t>
+        <w:t xml:space="preserve"> (company number 00000002) of Floor 3, 26 Copperfield Yard, London ZZ4 5PQ (the "Company")</w:t>
       </w:r>
     </w:p>
     <w:p>

</xml_diff>